<commit_message>
updated some assignments and lecture 5
</commit_message>
<xml_diff>
--- a/assignments/Conceptual_Figure.docx
+++ b/assignments/Conceptual_Figure.docx
@@ -7,6 +7,7 @@
         <w:pStyle w:val="Title"/>
         <w:rPr>
           <w:i w:val="1"/>
+          <w:iCs w:val="1"/>
         </w:rPr>
       </w:pPr>
       <w:bookmarkStart w:colFirst="0" w:colLast="0" w:name="_lbou0aq4mlyv" w:id="0"/>
@@ -174,6 +175,7 @@
       <w:r>
         <w:rPr>
           <w:i w:val="1"/>
+          <w:iCs w:val="1"/>
           <w:sz w:val="24"/>
           <w:szCs w:val="24"/>
           <w:rtl w:val="0"/>
@@ -424,11 +426,19 @@
       </w:pPr>
     </w:pPrDefault>
   </w:docDefaults>
+  <w:style w:type="table" w:styleId="TableNormal" w:default="1">
+    <w:name w:val="TableNormal"/>
+    <w:tblPr>
+      <w:tblCellMar>
+        <w:top w:w="100.0" w:type="dxa"/>
+        <w:left w:w="100.0" w:type="dxa"/>
+        <w:bottom w:w="100.0" w:type="dxa"/>
+        <w:right w:w="100.0" w:type="dxa"/>
+      </w:tblCellMar>
+    </w:tblPr>
+  </w:style>
   <w:style w:type="paragraph" w:styleId="Normal" w:default="1">
     <w:name w:val="normal"/>
-  </w:style>
-  <w:style w:type="table" w:styleId="TableNormal" w:default="1">
-    <w:name w:val="Table Normal"/>
   </w:style>
   <w:style w:type="paragraph" w:styleId="Heading1">
     <w:name w:val="heading 1"/>
@@ -457,6 +467,7 @@
     </w:pPr>
     <w:rPr>
       <w:b w:val="0"/>
+      <w:bCs w:val="0"/>
       <w:sz w:val="32"/>
       <w:szCs w:val="32"/>
     </w:rPr>
@@ -473,6 +484,7 @@
     </w:pPr>
     <w:rPr>
       <w:b w:val="0"/>
+      <w:bCs w:val="0"/>
       <w:color w:val="434343"/>
       <w:sz w:val="28"/>
       <w:szCs w:val="28"/>
@@ -522,6 +534,7 @@
     </w:pPr>
     <w:rPr>
       <w:i w:val="1"/>
+      <w:iCs w:val="1"/>
       <w:color w:val="666666"/>
       <w:sz w:val="22"/>
       <w:szCs w:val="22"/>
@@ -555,6 +568,7 @@
     <w:rPr>
       <w:rFonts w:ascii="Arial" w:cs="Arial" w:eastAsia="Arial" w:hAnsi="Arial"/>
       <w:i w:val="0"/>
+      <w:iCs w:val="0"/>
       <w:color w:val="666666"/>
       <w:sz w:val="30"/>
       <w:szCs w:val="30"/>

</xml_diff>